<commit_message>
Doc : emplacement du logiciel + procédure de téléchargement des données Power BI
Ajoute à la documentation Word :
- L'emplacement du logiciel sur le lecteur réseau (S:\...\3. Korrect'eau) et le
  lancement de Korrect'eau.exe.
- La procédure de téléchargement des données depuis le Power BI Exploitation :
  choix du mode de relève, filtre Code branchement = 0 (compteurs actifs),
  passage en mode Focus, puis « ⋯ » → « Exporter les données ».
- 3 encadrés légendés réservés aux captures d'écran (à insérer).

Co-Authored-By: Claude Opus 4.8 <noreply@anthropic.com>
Claude-Session: https://claude.ai/code/session_01MNBAg3ANVSBwWZxw9AfDaE
</commit_message>
<xml_diff>
--- a/Korrecteau_Documentation.docx
+++ b/Korrecteau_Documentation.docx
@@ -1153,15 +1153,239 @@
     </w:p>
     <w:p>
       <w:pPr>
-        <w:pStyle w:val="ListParagraph"/>
-        <w:numPr>
-          <w:ilvl w:val="0"/>
-          <w:numId w:val="1"/>
-        </w:numPr>
-        <w:spacing w:after="40"/>
-      </w:pPr>
-      <w:r>
-        <w:t xml:space="preserve">Double-cliquer sur Korrecteau.exe.</w:t>
+        <w:pStyle w:val="Heading2"/>
+        <w:spacing w:after="80" w:before="180"/>
+      </w:pPr>
+      <w:r>
+        <w:rPr>
+          <w:b/>
+          <w:bCs/>
+        </w:rPr>
+        <w:t xml:space="preserve">0. Où se trouve le logiciel</w:t>
+      </w:r>
+    </w:p>
+    <w:p>
+      <w:pPr>
+        <w:spacing w:after="80"/>
+      </w:pPr>
+      <w:r>
+        <w:t xml:space="preserve">Le logiciel est installé sur le lecteur réseau, à l'emplacement suivant :</w:t>
+      </w:r>
+    </w:p>
+    <w:p>
+      <w:pPr>
+        <w:shd w:fill="F2F2F2" w:val="clear"/>
+        <w:spacing w:after="80"/>
+      </w:pPr>
+      <w:r>
+        <w:rPr>
+          <w:rFonts w:ascii="Consolas" w:cs="Consolas" w:eastAsia="Consolas" w:hAnsi="Consolas"/>
+          <w:sz w:val="20"/>
+          <w:szCs w:val="20"/>
+        </w:rPr>
+        <w:t xml:space="preserve">S:\Technique\9. Télérelève\1. Opérationnel\2. Compteurs\4. Données patrimoniales\3. Korrect'eau</w:t>
+      </w:r>
+    </w:p>
+    <w:p>
+      <w:pPr>
+        <w:spacing w:after="80"/>
+      </w:pPr>
+      <w:r>
+        <w:t xml:space="preserve">Pour lancer l'application, double-cliquer sur </w:t>
+      </w:r>
+      <w:r>
+        <w:rPr>
+          <w:b/>
+          <w:bCs/>
+        </w:rPr>
+        <w:t xml:space="preserve">Korrect'eau.exe</w:t>
+      </w:r>
+      <w:r>
+        <w:t xml:space="preserve">.</w:t>
+      </w:r>
+    </w:p>
+    <w:p>
+      <w:pPr>
+        <w:pStyle w:val="Heading2"/>
+        <w:spacing w:after="80" w:before="180"/>
+      </w:pPr>
+      <w:r>
+        <w:rPr>
+          <w:b/>
+          <w:bCs/>
+        </w:rPr>
+        <w:t xml:space="preserve">1. Où télécharger les données à analyser</w:t>
+      </w:r>
+    </w:p>
+    <w:p>
+      <w:pPr>
+        <w:spacing w:after="80"/>
+      </w:pPr>
+      <w:r>
+        <w:t xml:space="preserve">Les données proviennent du </w:t>
+      </w:r>
+      <w:r>
+        <w:rPr>
+          <w:b/>
+          <w:bCs/>
+        </w:rPr>
+        <w:t xml:space="preserve">Power BI Exploitation</w:t>
+      </w:r>
+      <w:r>
+        <w:t xml:space="preserve">.</w:t>
+      </w:r>
+    </w:p>
+    <w:p>
+      <w:pPr>
+        <w:pStyle w:val="ListParagraph"/>
+        <w:numPr>
+          <w:ilvl w:val="0"/>
+          <w:numId w:val="1"/>
+        </w:numPr>
+        <w:spacing w:after="40"/>
+      </w:pPr>
+      <w:r>
+        <w:t xml:space="preserve">Choisir le mode de relève que l'on veut analyser (Manuelle, Radiorelève ou Télérelève) — voir capture 1.</w:t>
+      </w:r>
+    </w:p>
+    <w:p>
+      <w:pPr>
+        <w:pBdr>
+          <w:top w:val="dashed" w:color="AAAAAA" w:sz="6" w:space="6"/>
+          <w:bottom w:val="dashed" w:color="AAAAAA" w:sz="6" w:space="6"/>
+          <w:left w:val="dashed" w:color="AAAAAA" w:sz="6" w:space="6"/>
+          <w:right w:val="dashed" w:color="AAAAAA" w:sz="6" w:space="6"/>
+        </w:pBdr>
+        <w:spacing w:after="120" w:before="40"/>
+        <w:jc w:val="center"/>
+      </w:pPr>
+      <w:r>
+        <w:rPr>
+          <w:i/>
+          <w:iCs/>
+          <w:color w:val="808080"/>
+        </w:rPr>
+        <w:t xml:space="preserve">🖼️ Capture 1 — sélection du « Mode de relève » dans le Power BI Exploitation</w:t>
+      </w:r>
+    </w:p>
+    <w:p>
+      <w:pPr>
+        <w:pStyle w:val="ListParagraph"/>
+        <w:numPr>
+          <w:ilvl w:val="0"/>
+          <w:numId w:val="1"/>
+        </w:numPr>
+        <w:spacing w:after="40"/>
+      </w:pPr>
+      <w:r>
+        <w:t xml:space="preserve">Filtrer le Code branchement sur 0, afin de ne garder que les compteurs actifs — voir capture 2.</w:t>
+      </w:r>
+    </w:p>
+    <w:p>
+      <w:pPr>
+        <w:pBdr>
+          <w:top w:val="dashed" w:color="AAAAAA" w:sz="6" w:space="6"/>
+          <w:bottom w:val="dashed" w:color="AAAAAA" w:sz="6" w:space="6"/>
+          <w:left w:val="dashed" w:color="AAAAAA" w:sz="6" w:space="6"/>
+          <w:right w:val="dashed" w:color="AAAAAA" w:sz="6" w:space="6"/>
+        </w:pBdr>
+        <w:spacing w:after="120" w:before="40"/>
+        <w:jc w:val="center"/>
+      </w:pPr>
+      <w:r>
+        <w:rPr>
+          <w:i/>
+          <w:iCs/>
+          <w:color w:val="808080"/>
+        </w:rPr>
+        <w:t xml:space="preserve">🖼️ Capture 2 — filtre « Code branchement » = 0 (compteurs actifs)</w:t>
+      </w:r>
+    </w:p>
+    <w:p>
+      <w:pPr>
+        <w:pStyle w:val="ListParagraph"/>
+        <w:numPr>
+          <w:ilvl w:val="0"/>
+          <w:numId w:val="1"/>
+        </w:numPr>
+        <w:spacing w:after="40"/>
+      </w:pPr>
+      <w:r>
+        <w:t xml:space="preserve">Passer le tableau des données en mode Focus (icône en haut à droite de la visualisation) — voir capture 3.</w:t>
+      </w:r>
+    </w:p>
+    <w:p>
+      <w:pPr>
+        <w:pBdr>
+          <w:top w:val="dashed" w:color="AAAAAA" w:sz="6" w:space="6"/>
+          <w:bottom w:val="dashed" w:color="AAAAAA" w:sz="6" w:space="6"/>
+          <w:left w:val="dashed" w:color="AAAAAA" w:sz="6" w:space="6"/>
+          <w:right w:val="dashed" w:color="AAAAAA" w:sz="6" w:space="6"/>
+        </w:pBdr>
+        <w:spacing w:after="120" w:before="40"/>
+        <w:jc w:val="center"/>
+      </w:pPr>
+      <w:r>
+        <w:rPr>
+          <w:i/>
+          <w:iCs/>
+          <w:color w:val="808080"/>
+        </w:rPr>
+        <w:t xml:space="preserve">🖼️ Capture 3 — tableau des données en mode Focus</w:t>
+      </w:r>
+    </w:p>
+    <w:p>
+      <w:pPr>
+        <w:pStyle w:val="ListParagraph"/>
+        <w:numPr>
+          <w:ilvl w:val="0"/>
+          <w:numId w:val="1"/>
+        </w:numPr>
+        <w:spacing w:after="40"/>
+      </w:pPr>
+      <w:r>
+        <w:t xml:space="preserve">Cliquer sur les trois petits points « ⋯ » en haut à droite du tableau, puis sur « Exporter les données ».</w:t>
+      </w:r>
+    </w:p>
+    <w:p>
+      <w:pPr>
+        <w:spacing w:after="80"/>
+      </w:pPr>
+      <w:r>
+        <w:rPr>
+          <w:b/>
+          <w:bCs/>
+        </w:rPr>
+        <w:t xml:space="preserve">Astuce : </w:t>
+      </w:r>
+      <w:r>
+        <w:t xml:space="preserve">téléchargez un fichier par mode de relève (Radio, Télé, Manuelle) puis chargez-les dans les zones correspondantes de Korrect'eau.</w:t>
+      </w:r>
+    </w:p>
+    <w:p>
+      <w:pPr>
+        <w:pStyle w:val="Heading2"/>
+        <w:spacing w:after="80" w:before="180"/>
+      </w:pPr>
+      <w:r>
+        <w:rPr>
+          <w:b/>
+          <w:bCs/>
+        </w:rPr>
+        <w:t xml:space="preserve">2. Lancer l'analyse</w:t>
+      </w:r>
+    </w:p>
+    <w:p>
+      <w:pPr>
+        <w:pStyle w:val="ListParagraph"/>
+        <w:numPr>
+          <w:ilvl w:val="0"/>
+          <w:numId w:val="1"/>
+        </w:numPr>
+        <w:spacing w:after="40"/>
+      </w:pPr>
+      <w:r>
+        <w:t xml:space="preserve">Double-cliquer sur Korrect'eau.exe.</w:t>
       </w:r>
     </w:p>
     <w:p>

</xml_diff>

<commit_message>
Doc : intégration des 3 captures d'écran Power BI
Incruste les captures dans la procédure de téléchargement des données :
- Capture 1 : sélection du mode de relève
- Capture 2 : filtre Code branchement = 0 (compteurs actifs)
- Capture 3 : tableau des données en mode Focus

Co-Authored-By: Claude Opus 4.8 <noreply@anthropic.com>
Claude-Session: https://claude.ai/code/session_01MNBAg3ANVSBwWZxw9AfDaE
</commit_message>
<xml_diff>
--- a/Korrecteau_Documentation.docx
+++ b/Korrecteau_Documentation.docx
@@ -1250,13 +1250,53 @@
     </w:p>
     <w:p>
       <w:pPr>
-        <w:pBdr>
-          <w:top w:val="dashed" w:color="AAAAAA" w:sz="6" w:space="6"/>
-          <w:bottom w:val="dashed" w:color="AAAAAA" w:sz="6" w:space="6"/>
-          <w:left w:val="dashed" w:color="AAAAAA" w:sz="6" w:space="6"/>
-          <w:right w:val="dashed" w:color="AAAAAA" w:sz="6" w:space="6"/>
-        </w:pBdr>
-        <w:spacing w:after="120" w:before="40"/>
+        <w:spacing w:after="20" w:before="40"/>
+        <w:jc w:val="center"/>
+      </w:pPr>
+      <w:r>
+        <w:drawing>
+          <wp:inline distT="0" distB="0" distL="0" distR="0">
+            <wp:extent cx="5905500" cy="828675"/>
+            <wp:effectExtent t="0" r="0" b="0" l="0"/>
+            <wp:docPr id="1" name="" descr="" title=""/>
+            <wp:cNvGraphicFramePr>
+              <a:graphicFrameLocks xmlns:a="http://schemas.openxmlformats.org/drawingml/2006/main" noChangeAspect="1"/>
+            </wp:cNvGraphicFramePr>
+            <a:graphic xmlns:a="http://schemas.openxmlformats.org/drawingml/2006/main">
+              <a:graphicData uri="http://schemas.openxmlformats.org/drawingml/2006/picture">
+                <pic:pic xmlns:pic="http://schemas.openxmlformats.org/drawingml/2006/picture">
+                  <pic:nvPicPr>
+                    <pic:cNvPr id="0" name="" descr=""/>
+                    <pic:cNvPicPr>
+                      <a:picLocks noChangeAspect="1" noChangeArrowheads="1"/>
+                    </pic:cNvPicPr>
+                  </pic:nvPicPr>
+                  <pic:blipFill>
+                    <a:blip r:embed="rId7" cstate="none"/>
+                    <a:srcRect/>
+                    <a:stretch>
+                      <a:fillRect/>
+                    </a:stretch>
+                  </pic:blipFill>
+                  <pic:spPr bwMode="auto">
+                    <a:xfrm>
+                      <a:off x="0" y="0"/>
+                      <a:ext cx="5905500" cy="828675"/>
+                    </a:xfrm>
+                    <a:prstGeom prst="rect">
+                      <a:avLst/>
+                    </a:prstGeom>
+                  </pic:spPr>
+                </pic:pic>
+              </a:graphicData>
+            </a:graphic>
+          </wp:inline>
+        </w:drawing>
+      </w:r>
+    </w:p>
+    <w:p>
+      <w:pPr>
+        <w:spacing w:after="120"/>
         <w:jc w:val="center"/>
       </w:pPr>
       <w:r>
@@ -1264,8 +1304,10 @@
           <w:i/>
           <w:iCs/>
           <w:color w:val="808080"/>
-        </w:rPr>
-        <w:t xml:space="preserve">🖼️ Capture 1 — sélection du « Mode de relève » dans le Power BI Exploitation</w:t>
+          <w:sz w:val="18"/>
+          <w:szCs w:val="18"/>
+        </w:rPr>
+        <w:t xml:space="preserve">Capture 1 — sélection du « Mode de relève » dans le Power BI Exploitation</w:t>
       </w:r>
     </w:p>
     <w:p>
@@ -1283,13 +1325,53 @@
     </w:p>
     <w:p>
       <w:pPr>
-        <w:pBdr>
-          <w:top w:val="dashed" w:color="AAAAAA" w:sz="6" w:space="6"/>
-          <w:bottom w:val="dashed" w:color="AAAAAA" w:sz="6" w:space="6"/>
-          <w:left w:val="dashed" w:color="AAAAAA" w:sz="6" w:space="6"/>
-          <w:right w:val="dashed" w:color="AAAAAA" w:sz="6" w:space="6"/>
-        </w:pBdr>
-        <w:spacing w:after="120" w:before="40"/>
+        <w:spacing w:after="20" w:before="40"/>
+        <w:jc w:val="center"/>
+      </w:pPr>
+      <w:r>
+        <w:drawing>
+          <wp:inline distT="0" distB="0" distL="0" distR="0">
+            <wp:extent cx="5905500" cy="809625"/>
+            <wp:effectExtent t="0" r="0" b="0" l="0"/>
+            <wp:docPr id="1" name="" descr="" title=""/>
+            <wp:cNvGraphicFramePr>
+              <a:graphicFrameLocks xmlns:a="http://schemas.openxmlformats.org/drawingml/2006/main" noChangeAspect="1"/>
+            </wp:cNvGraphicFramePr>
+            <a:graphic xmlns:a="http://schemas.openxmlformats.org/drawingml/2006/main">
+              <a:graphicData uri="http://schemas.openxmlformats.org/drawingml/2006/picture">
+                <pic:pic xmlns:pic="http://schemas.openxmlformats.org/drawingml/2006/picture">
+                  <pic:nvPicPr>
+                    <pic:cNvPr id="0" name="" descr=""/>
+                    <pic:cNvPicPr>
+                      <a:picLocks noChangeAspect="1" noChangeArrowheads="1"/>
+                    </pic:cNvPicPr>
+                  </pic:nvPicPr>
+                  <pic:blipFill>
+                    <a:blip r:embed="rId8" cstate="none"/>
+                    <a:srcRect/>
+                    <a:stretch>
+                      <a:fillRect/>
+                    </a:stretch>
+                  </pic:blipFill>
+                  <pic:spPr bwMode="auto">
+                    <a:xfrm>
+                      <a:off x="0" y="0"/>
+                      <a:ext cx="5905500" cy="809625"/>
+                    </a:xfrm>
+                    <a:prstGeom prst="rect">
+                      <a:avLst/>
+                    </a:prstGeom>
+                  </pic:spPr>
+                </pic:pic>
+              </a:graphicData>
+            </a:graphic>
+          </wp:inline>
+        </w:drawing>
+      </w:r>
+    </w:p>
+    <w:p>
+      <w:pPr>
+        <w:spacing w:after="120"/>
         <w:jc w:val="center"/>
       </w:pPr>
       <w:r>
@@ -1297,8 +1379,10 @@
           <w:i/>
           <w:iCs/>
           <w:color w:val="808080"/>
-        </w:rPr>
-        <w:t xml:space="preserve">🖼️ Capture 2 — filtre « Code branchement » = 0 (compteurs actifs)</w:t>
+          <w:sz w:val="18"/>
+          <w:szCs w:val="18"/>
+        </w:rPr>
+        <w:t xml:space="preserve">Capture 2 — filtre « Code branchement » = 0 (compteurs actifs)</w:t>
       </w:r>
     </w:p>
     <w:p>
@@ -1316,13 +1400,53 @@
     </w:p>
     <w:p>
       <w:pPr>
-        <w:pBdr>
-          <w:top w:val="dashed" w:color="AAAAAA" w:sz="6" w:space="6"/>
-          <w:bottom w:val="dashed" w:color="AAAAAA" w:sz="6" w:space="6"/>
-          <w:left w:val="dashed" w:color="AAAAAA" w:sz="6" w:space="6"/>
-          <w:right w:val="dashed" w:color="AAAAAA" w:sz="6" w:space="6"/>
-        </w:pBdr>
-        <w:spacing w:after="120" w:before="40"/>
+        <w:spacing w:after="20" w:before="40"/>
+        <w:jc w:val="center"/>
+      </w:pPr>
+      <w:r>
+        <w:drawing>
+          <wp:inline distT="0" distB="0" distL="0" distR="0">
+            <wp:extent cx="5905500" cy="1543050"/>
+            <wp:effectExtent t="0" r="0" b="0" l="0"/>
+            <wp:docPr id="1" name="" descr="" title=""/>
+            <wp:cNvGraphicFramePr>
+              <a:graphicFrameLocks xmlns:a="http://schemas.openxmlformats.org/drawingml/2006/main" noChangeAspect="1"/>
+            </wp:cNvGraphicFramePr>
+            <a:graphic xmlns:a="http://schemas.openxmlformats.org/drawingml/2006/main">
+              <a:graphicData uri="http://schemas.openxmlformats.org/drawingml/2006/picture">
+                <pic:pic xmlns:pic="http://schemas.openxmlformats.org/drawingml/2006/picture">
+                  <pic:nvPicPr>
+                    <pic:cNvPr id="0" name="" descr=""/>
+                    <pic:cNvPicPr>
+                      <a:picLocks noChangeAspect="1" noChangeArrowheads="1"/>
+                    </pic:cNvPicPr>
+                  </pic:nvPicPr>
+                  <pic:blipFill>
+                    <a:blip r:embed="rId9" cstate="none"/>
+                    <a:srcRect/>
+                    <a:stretch>
+                      <a:fillRect/>
+                    </a:stretch>
+                  </pic:blipFill>
+                  <pic:spPr bwMode="auto">
+                    <a:xfrm>
+                      <a:off x="0" y="0"/>
+                      <a:ext cx="5905500" cy="1543050"/>
+                    </a:xfrm>
+                    <a:prstGeom prst="rect">
+                      <a:avLst/>
+                    </a:prstGeom>
+                  </pic:spPr>
+                </pic:pic>
+              </a:graphicData>
+            </a:graphic>
+          </wp:inline>
+        </w:drawing>
+      </w:r>
+    </w:p>
+    <w:p>
+      <w:pPr>
+        <w:spacing w:after="120"/>
         <w:jc w:val="center"/>
       </w:pPr>
       <w:r>
@@ -1330,8 +1454,10 @@
           <w:i/>
           <w:iCs/>
           <w:color w:val="808080"/>
-        </w:rPr>
-        <w:t xml:space="preserve">🖼️ Capture 3 — tableau des données en mode Focus</w:t>
+          <w:sz w:val="18"/>
+          <w:szCs w:val="18"/>
+        </w:rPr>
+        <w:t xml:space="preserve">Capture 3 — tableau des données en mode Focus</w:t>
       </w:r>
     </w:p>
     <w:p>

</xml_diff>